<commit_message>
Update lab 4 report
</commit_message>
<xml_diff>
--- a/labs/lab04/report/arch-pc-lab04-report.docx
+++ b/labs/lab04/report/arch-pc-lab04-report.docx
@@ -135,7 +135,7 @@
         <w:t xml:space="preserve"> </w:t>
       </w:r>
       <w:r>
-        <w:t xml:space="preserve">документе</w:t>
+        <w:t xml:space="preserve">отчете</w:t>
       </w:r>
       <w:r>
         <w:t xml:space="preserve"> </w:t>
@@ -285,25 +285,7 @@
         <w:t xml:space="preserve"> </w:t>
       </w:r>
       <w:r>
-        <w:t xml:space="preserve">компоновщика</w:t>
-      </w:r>
-      <w:r>
-        <w:t xml:space="preserve"> </w:t>
-      </w:r>
-      <w:r>
-        <w:t xml:space="preserve">в</w:t>
-      </w:r>
-      <w:r>
-        <w:t xml:space="preserve"> </w:t>
-      </w:r>
-      <w:r>
-        <w:t xml:space="preserve">среде</w:t>
-      </w:r>
-      <w:r>
-        <w:t xml:space="preserve"> </w:t>
-      </w:r>
-      <w:r>
-        <w:t xml:space="preserve">Linux.</w:t>
+        <w:t xml:space="preserve">компоновщика.</w:t>
       </w:r>
     </w:p>
     <w:sdt>
@@ -332,13 +314,13 @@
         </w:p>
       </w:sdtContent>
     </w:sdt>
-    <w:bookmarkStart w:id="57" w:name="цель-работы"/>
+    <w:bookmarkStart w:id="20" w:name="цель-работы"/>
     <w:p>
       <w:pPr>
         <w:pStyle w:val="Heading1"/>
       </w:pPr>
       <w:r>
-        <w:t xml:space="preserve">1. Цель работы</w:t>
+        <w:t xml:space="preserve">1. 1 Цель работы</w:t>
       </w:r>
     </w:p>
     <w:p>
@@ -346,28 +328,26 @@
         <w:pStyle w:val="FirstParagraph"/>
       </w:pPr>
       <w:r>
-        <w:t xml:space="preserve">Освоение процедуры компиляции и сборки программ, написанных на ассемблере</w:t>
-      </w:r>
-      <w:r>
-        <w:t xml:space="preserve"> </w:t>
-      </w:r>
-      <w:r>
-        <w:t xml:space="preserve">NASM.</w:t>
-      </w:r>
-      <w:r>
-        <w:t xml:space="preserve"> </w:t>
-      </w:r>
-      <w:r>
-        <w:t xml:space="preserve"># Выполнение лабораторной работы</w:t>
+        <w:t xml:space="preserve">Освоение процедуры компиляции и сборки программ, написанных на ассемблере NASM.</w:t>
       </w:r>
     </w:p>
-    <w:bookmarkStart w:id="32" w:name="программа-hello-world"/>
+    <w:bookmarkEnd w:id="20"/>
+    <w:bookmarkStart w:id="58" w:name="выполнение-лабораторной-работы"/>
     <w:p>
       <w:pPr>
+        <w:pStyle w:val="Heading1"/>
+      </w:pPr>
+      <w:r>
+        <w:t xml:space="preserve">2. 2 Выполнение лабораторной работы</w:t>
+      </w:r>
+    </w:p>
+    <w:bookmarkStart w:id="33" w:name="программа-hello-world"/>
+    <w:p>
+      <w:pPr>
         <w:pStyle w:val="Heading2"/>
       </w:pPr>
       <w:r>
-        <w:t xml:space="preserve">1.1 Программа Hello world!</w:t>
+        <w:t xml:space="preserve">2.1 2.1 Программа Hello world!</w:t>
       </w:r>
     </w:p>
     <w:p>
@@ -375,24 +355,9 @@
         <w:pStyle w:val="FirstParagraph"/>
       </w:pPr>
       <w:r>
-        <w:t xml:space="preserve">Сначала я открыла терминал и сформировала рабочую директорию для хранения файлов текущего проекта с помощью</w:t>
-      </w:r>
-      <w:r>
-        <w:t xml:space="preserve"> </w:t>
-      </w:r>
-      <w:r>
-        <w:rPr>
-          <w:rStyle w:val="VerbatimChar"/>
-        </w:rPr>
-        <w:t xml:space="preserve">mkdir</w:t>
-      </w:r>
-      <w:r>
-        <w:t xml:space="preserve"> </w:t>
-      </w:r>
-      <w:r>
-        <w:t xml:space="preserve">(</w:t>
-      </w:r>
-      <w:hyperlink w:anchor="fig-1">
+        <w:t xml:space="preserve">Сначала я открыла терминал и сформировала рабочую директорию для хранения файлов текущего проекта с помощью mkdir (</w:t>
+      </w:r>
+      <w:hyperlink w:anchor="fig-1.1">
         <w:r>
           <w:rPr>
             <w:rStyle w:val="Hyperlink"/>
@@ -418,7 +383,7 @@
       <w:tr>
         <w:tc>
           <w:tcPr/>
-          <w:bookmarkStart w:id="23" w:name="fig-1"/>
+          <w:bookmarkStart w:id="24" w:name="fig-1.1"/>
           <w:p>
             <w:pPr>
               <w:pStyle w:val="Compact"/>
@@ -429,18 +394,18 @@
                 <wp:inline>
                   <wp:extent cx="4267200" cy="392651"/>
                   <wp:effectExtent b="0" l="0" r="0" t="0"/>
-                  <wp:docPr descr="" title="" id="21" name="Picture"/>
+                  <wp:docPr descr="" title="" id="22" name="Picture"/>
                   <a:graphic>
                     <a:graphicData uri="http://schemas.openxmlformats.org/drawingml/2006/picture">
                       <pic:pic>
                         <pic:nvPicPr>
-                          <pic:cNvPr descr="image/1.png" id="22" name="Picture"/>
+                          <pic:cNvPr descr="image/1.png" id="23" name="Picture"/>
                           <pic:cNvPicPr>
                             <a:picLocks noChangeArrowheads="1" noChangeAspect="1"/>
                           </pic:cNvPicPr>
                         </pic:nvPicPr>
                         <pic:blipFill>
-                          <a:blip r:embed="rId20"/>
+                          <a:blip r:embed="rId21"/>
                           <a:stretch>
                             <a:fillRect/>
                           </a:stretch>
@@ -480,7 +445,7 @@
               <w:t xml:space="preserve">Рисунок 1: Создание каталога</w:t>
             </w:r>
           </w:p>
-          <w:bookmarkEnd w:id="23"/>
+          <w:bookmarkEnd w:id="24"/>
         </w:tc>
       </w:tr>
     </w:tbl>
@@ -489,24 +454,9 @@
         <w:pStyle w:val="BodyText"/>
       </w:pPr>
       <w:r>
-        <w:t xml:space="preserve">Затем, перейдя в новую папку, я сгенерировала пустой текстовый документ, дав ему название</w:t>
-      </w:r>
-      <w:r>
-        <w:t xml:space="preserve"> </w:t>
-      </w:r>
-      <w:r>
-        <w:rPr>
-          <w:rStyle w:val="VerbatimChar"/>
-        </w:rPr>
-        <w:t xml:space="preserve">hello.asm</w:t>
-      </w:r>
-      <w:r>
-        <w:t xml:space="preserve"> </w:t>
-      </w:r>
-      <w:r>
-        <w:t xml:space="preserve">(</w:t>
-      </w:r>
-      <w:hyperlink w:anchor="fig-2">
+        <w:t xml:space="preserve">Затем, перейдя в новую папку, я сгенерировала пустой текстовый документ, дав ему название hello.asm (</w:t>
+      </w:r>
+      <w:hyperlink w:anchor="fig-1.2">
         <w:r>
           <w:rPr>
             <w:rStyle w:val="Hyperlink"/>
@@ -532,7 +482,7 @@
       <w:tr>
         <w:tc>
           <w:tcPr/>
-          <w:bookmarkStart w:id="27" w:name="fig-2"/>
+          <w:bookmarkStart w:id="28" w:name="fig-1.2"/>
           <w:p>
             <w:pPr>
               <w:pStyle w:val="Compact"/>
@@ -543,18 +493,18 @@
                 <wp:inline>
                   <wp:extent cx="4267200" cy="550606"/>
                   <wp:effectExtent b="0" l="0" r="0" t="0"/>
-                  <wp:docPr descr="" title="" id="25" name="Picture"/>
+                  <wp:docPr descr="" title="" id="26" name="Picture"/>
                   <a:graphic>
                     <a:graphicData uri="http://schemas.openxmlformats.org/drawingml/2006/picture">
                       <pic:pic>
                         <pic:nvPicPr>
-                          <pic:cNvPr descr="image/2.png" id="26" name="Picture"/>
+                          <pic:cNvPr descr="image/2.png" id="27" name="Picture"/>
                           <pic:cNvPicPr>
                             <a:picLocks noChangeArrowheads="1" noChangeAspect="1"/>
                           </pic:cNvPicPr>
                         </pic:nvPicPr>
                         <pic:blipFill>
-                          <a:blip r:embed="rId24"/>
+                          <a:blip r:embed="rId25"/>
                           <a:stretch>
                             <a:fillRect/>
                           </a:stretch>
@@ -594,7 +544,7 @@
               <w:t xml:space="preserve">Рисунок 2: Переход в каталог и создание hello.asm</w:t>
             </w:r>
           </w:p>
-          <w:bookmarkEnd w:id="27"/>
+          <w:bookmarkEnd w:id="28"/>
         </w:tc>
       </w:tr>
     </w:tbl>
@@ -605,7 +555,7 @@
       <w:r>
         <w:t xml:space="preserve">С помощью текстового редактора я открыла этот файл и набрала в нем исходный код первой программы (</w:t>
       </w:r>
-      <w:hyperlink w:anchor="fig-3">
+      <w:hyperlink w:anchor="fig-1.3">
         <w:r>
           <w:rPr>
             <w:rStyle w:val="Hyperlink"/>
@@ -631,7 +581,7 @@
       <w:tr>
         <w:tc>
           <w:tcPr/>
-          <w:bookmarkStart w:id="31" w:name="fig-3"/>
+          <w:bookmarkStart w:id="32" w:name="fig-1.3"/>
           <w:p>
             <w:pPr>
               <w:pStyle w:val="Compact"/>
@@ -642,18 +592,18 @@
                 <wp:inline>
                   <wp:extent cx="4267200" cy="2198658"/>
                   <wp:effectExtent b="0" l="0" r="0" t="0"/>
-                  <wp:docPr descr="" title="" id="29" name="Picture"/>
+                  <wp:docPr descr="" title="" id="30" name="Picture"/>
                   <a:graphic>
                     <a:graphicData uri="http://schemas.openxmlformats.org/drawingml/2006/picture">
                       <pic:pic>
                         <pic:nvPicPr>
-                          <pic:cNvPr descr="image/3.png" id="30" name="Picture"/>
+                          <pic:cNvPr descr="image/3.png" id="31" name="Picture"/>
                           <pic:cNvPicPr>
                             <a:picLocks noChangeArrowheads="1" noChangeAspect="1"/>
                           </pic:cNvPicPr>
                         </pic:nvPicPr>
                         <pic:blipFill>
-                          <a:blip r:embed="rId28"/>
+                          <a:blip r:embed="rId29"/>
                           <a:stretch>
                             <a:fillRect/>
                           </a:stretch>
@@ -693,18 +643,18 @@
               <w:t xml:space="preserve">Рисунок 3: Файл hello.asm</w:t>
             </w:r>
           </w:p>
-          <w:bookmarkEnd w:id="31"/>
+          <w:bookmarkEnd w:id="32"/>
         </w:tc>
       </w:tr>
     </w:tbl>
-    <w:bookmarkEnd w:id="32"/>
-    <w:bookmarkStart w:id="37" w:name="транслятор-nasm"/>
+    <w:bookmarkEnd w:id="33"/>
+    <w:bookmarkStart w:id="38" w:name="транслятор-nasm"/>
     <w:p>
       <w:pPr>
         <w:pStyle w:val="Heading2"/>
       </w:pPr>
       <w:r>
-        <w:t xml:space="preserve">1.2 Транслятор NASM</w:t>
+        <w:t xml:space="preserve">2.2 2.2 Транслятор NASM</w:t>
       </w:r>
     </w:p>
     <w:p>
@@ -733,7 +683,7 @@
         <w:rPr>
           <w:rStyle w:val="VerbatimChar"/>
         </w:rPr>
-        <w:t xml:space="preserve">hello.o</w:t>
+        <w:t xml:space="preserve">hello.о</w:t>
       </w:r>
       <w:r>
         <w:t xml:space="preserve"> </w:t>
@@ -741,7 +691,7 @@
       <w:r>
         <w:t xml:space="preserve">(</w:t>
       </w:r>
-      <w:hyperlink w:anchor="fig-4">
+      <w:hyperlink w:anchor="fig-1.4">
         <w:r>
           <w:rPr>
             <w:rStyle w:val="Hyperlink"/>
@@ -767,7 +717,7 @@
       <w:tr>
         <w:tc>
           <w:tcPr/>
-          <w:bookmarkStart w:id="36" w:name="fig-4"/>
+          <w:bookmarkStart w:id="37" w:name="fig-1.4"/>
           <w:p>
             <w:pPr>
               <w:pStyle w:val="Compact"/>
@@ -778,18 +728,18 @@
                 <wp:inline>
                   <wp:extent cx="4267200" cy="550606"/>
                   <wp:effectExtent b="0" l="0" r="0" t="0"/>
-                  <wp:docPr descr="" title="" id="34" name="Picture"/>
+                  <wp:docPr descr="" title="" id="35" name="Picture"/>
                   <a:graphic>
                     <a:graphicData uri="http://schemas.openxmlformats.org/drawingml/2006/picture">
                       <pic:pic>
                         <pic:nvPicPr>
-                          <pic:cNvPr descr="image/4.png" id="35" name="Picture"/>
+                          <pic:cNvPr descr="image/4.png" id="36" name="Picture"/>
                           <pic:cNvPicPr>
                             <a:picLocks noChangeArrowheads="1" noChangeAspect="1"/>
                           </pic:cNvPicPr>
                         </pic:nvPicPr>
                         <pic:blipFill>
-                          <a:blip r:embed="rId33"/>
+                          <a:blip r:embed="rId34"/>
                           <a:stretch>
                             <a:fillRect/>
                           </a:stretch>
@@ -826,21 +776,21 @@
               <w:pStyle w:val="ImageCaption"/>
             </w:pPr>
             <w:r>
-              <w:t xml:space="preserve">Рисунок 4: Компиляция файла hello.asm и файл hello.o</w:t>
+              <w:t xml:space="preserve">Рисунок 4: Компиляция файла hello.asm и файл hello.о</w:t>
             </w:r>
           </w:p>
-          <w:bookmarkEnd w:id="36"/>
+          <w:bookmarkEnd w:id="37"/>
         </w:tc>
       </w:tr>
     </w:tbl>
-    <w:bookmarkEnd w:id="37"/>
-    <w:bookmarkStart w:id="42" w:name="Xdc17a5752fa00a483b4c767734f3f62aaf44a07"/>
+    <w:bookmarkEnd w:id="38"/>
+    <w:bookmarkStart w:id="43" w:name="Xdc17a5752fa00a483b4c767734f3f62aaf44a07"/>
     <w:p>
       <w:pPr>
         <w:pStyle w:val="Heading2"/>
       </w:pPr>
       <w:r>
-        <w:t xml:space="preserve">1.3 Расширенный синтаксис командной строки NASM</w:t>
+        <w:t xml:space="preserve">2.3 2.3 Расширенный синтаксис командной строки NASM</w:t>
       </w:r>
     </w:p>
     <w:p>
@@ -848,25 +798,7 @@
         <w:pStyle w:val="FirstParagraph"/>
       </w:pPr>
       <w:r>
-        <w:t xml:space="preserve">Затем я использовала расширенный синтаксис, скомпилировала файл</w:t>
-      </w:r>
-      <w:r>
-        <w:t xml:space="preserve"> </w:t>
-      </w:r>
-      <w:r>
-        <w:t xml:space="preserve">‘</w:t>
-      </w:r>
-      <w:r>
-        <w:t xml:space="preserve">hello.asm</w:t>
-      </w:r>
-      <w:r>
-        <w:t xml:space="preserve">’</w:t>
-      </w:r>
-      <w:r>
-        <w:t xml:space="preserve"> </w:t>
-      </w:r>
-      <w:r>
-        <w:t xml:space="preserve">в</w:t>
+        <w:t xml:space="preserve">Затем я использовала расширенный синтаксис, скомпилировала файл „hello.asm“ в</w:t>
       </w:r>
       <w:r>
         <w:t xml:space="preserve"> </w:t>
@@ -907,7 +839,7 @@
       <w:r>
         <w:t xml:space="preserve">, я проверила, что все требуемые файлы успешно сформированы (</w:t>
       </w:r>
-      <w:hyperlink w:anchor="fig-5">
+      <w:hyperlink w:anchor="fig-1.5">
         <w:r>
           <w:rPr>
             <w:rStyle w:val="Hyperlink"/>
@@ -933,7 +865,7 @@
       <w:tr>
         <w:tc>
           <w:tcPr/>
-          <w:bookmarkStart w:id="41" w:name="fig-5"/>
+          <w:bookmarkStart w:id="42" w:name="fig-1.5"/>
           <w:p>
             <w:pPr>
               <w:pStyle w:val="Compact"/>
@@ -944,18 +876,18 @@
                 <wp:inline>
                   <wp:extent cx="4267200" cy="355915"/>
                   <wp:effectExtent b="0" l="0" r="0" t="0"/>
-                  <wp:docPr descr="" title="" id="39" name="Picture"/>
+                  <wp:docPr descr="" title="" id="40" name="Picture"/>
                   <a:graphic>
                     <a:graphicData uri="http://schemas.openxmlformats.org/drawingml/2006/picture">
                       <pic:pic>
                         <pic:nvPicPr>
-                          <pic:cNvPr descr="image/5.png" id="40" name="Picture"/>
+                          <pic:cNvPr descr="image/5.png" id="41" name="Picture"/>
                           <pic:cNvPicPr>
                             <a:picLocks noChangeArrowheads="1" noChangeAspect="1"/>
                           </pic:cNvPicPr>
                         </pic:nvPicPr>
                         <pic:blipFill>
-                          <a:blip r:embed="rId38"/>
+                          <a:blip r:embed="rId39"/>
                           <a:stretch>
                             <a:fillRect/>
                           </a:stretch>
@@ -995,24 +927,36 @@
               <w:t xml:space="preserve">Рисунок 5: Компиляция файла</w:t>
             </w:r>
           </w:p>
-          <w:bookmarkEnd w:id="41"/>
+          <w:bookmarkEnd w:id="42"/>
         </w:tc>
       </w:tr>
     </w:tbl>
-    <w:bookmarkEnd w:id="42"/>
-    <w:bookmarkStart w:id="51" w:name="компоновщик-ld"/>
+    <w:bookmarkEnd w:id="43"/>
+    <w:bookmarkStart w:id="52" w:name="компоновщик-ld"/>
     <w:p>
       <w:pPr>
         <w:pStyle w:val="Heading2"/>
       </w:pPr>
       <w:r>
-        <w:t xml:space="preserve">1.4 Компоновщик LD</w:t>
+        <w:t xml:space="preserve">2.4 2.4 Компоновщик LD</w:t>
       </w:r>
     </w:p>
     <w:p>
       <w:pPr>
         <w:pStyle w:val="BlockText"/>
       </w:pPr>
+      <w:r>
+        <w:rPr>
+          <w:iCs/>
+          <w:i/>
+          <w:bCs/>
+          <w:b/>
+        </w:rPr>
+        <w:t xml:space="preserve">Примечание:</w:t>
+      </w:r>
+      <w:r>
+        <w:t xml:space="preserve"> </w:t>
+      </w:r>
       <w:r>
         <w:rPr>
           <w:iCs/>
@@ -1062,7 +1006,7 @@
           <w:iCs/>
           <w:i/>
         </w:rPr>
-        <w:t xml:space="preserve">i686-linux-gnu-ld</w:t>
+        <w:t xml:space="preserve">i686-Linux-gnu-Ld</w:t>
       </w:r>
       <w:r>
         <w:rPr>
@@ -1131,7 +1075,7 @@
       <w:r>
         <w:t xml:space="preserve">был создан корректно (</w:t>
       </w:r>
-      <w:hyperlink w:anchor="fig-6">
+      <w:hyperlink w:anchor="fig-1.6">
         <w:r>
           <w:rPr>
             <w:rStyle w:val="Hyperlink"/>
@@ -1157,7 +1101,7 @@
       <w:tr>
         <w:tc>
           <w:tcPr/>
-          <w:bookmarkStart w:id="46" w:name="fig-6"/>
+          <w:bookmarkStart w:id="47" w:name="fig-1.6"/>
           <w:p>
             <w:pPr>
               <w:pStyle w:val="Compact"/>
@@ -1168,18 +1112,18 @@
                 <wp:inline>
                   <wp:extent cx="4267200" cy="355915"/>
                   <wp:effectExtent b="0" l="0" r="0" t="0"/>
-                  <wp:docPr descr="" title="" id="44" name="Picture"/>
+                  <wp:docPr descr="" title="" id="45" name="Picture"/>
                   <a:graphic>
                     <a:graphicData uri="http://schemas.openxmlformats.org/drawingml/2006/picture">
                       <pic:pic>
                         <pic:nvPicPr>
-                          <pic:cNvPr descr="image/6.png" id="45" name="Picture"/>
+                          <pic:cNvPr descr="image/6.png" id="46" name="Picture"/>
                           <pic:cNvPicPr>
                             <a:picLocks noChangeArrowheads="1" noChangeAspect="1"/>
                           </pic:cNvPicPr>
                         </pic:nvPicPr>
                         <pic:blipFill>
-                          <a:blip r:embed="rId43"/>
+                          <a:blip r:embed="rId44"/>
                           <a:stretch>
                             <a:fillRect/>
                           </a:stretch>
@@ -1219,7 +1163,7 @@
               <w:t xml:space="preserve">Рисунок 6: Компоновка файла</w:t>
             </w:r>
           </w:p>
-          <w:bookmarkEnd w:id="46"/>
+          <w:bookmarkEnd w:id="47"/>
         </w:tc>
       </w:tr>
     </w:tbl>
@@ -1245,7 +1189,7 @@
       <w:r>
         <w:t xml:space="preserve">(</w:t>
       </w:r>
-      <w:hyperlink w:anchor="fig-7">
+      <w:hyperlink w:anchor="fig-1.7">
         <w:r>
           <w:rPr>
             <w:rStyle w:val="Hyperlink"/>
@@ -1263,7 +1207,7 @@
         <w:rPr>
           <w:rStyle w:val="VerbatimChar"/>
         </w:rPr>
-        <w:t xml:space="preserve">obj.o</w:t>
+        <w:t xml:space="preserve">obj.о</w:t>
       </w:r>
       <w:r>
         <w:t xml:space="preserve"> </w:t>
@@ -1298,7 +1242,7 @@
       <w:tr>
         <w:tc>
           <w:tcPr/>
-          <w:bookmarkStart w:id="50" w:name="fig-7"/>
+          <w:bookmarkStart w:id="51" w:name="fig-1.7"/>
           <w:p>
             <w:pPr>
               <w:pStyle w:val="Compact"/>
@@ -1309,18 +1253,18 @@
                 <wp:inline>
                   <wp:extent cx="4267200" cy="355915"/>
                   <wp:effectExtent b="0" l="0" r="0" t="0"/>
-                  <wp:docPr descr="" title="" id="48" name="Picture"/>
+                  <wp:docPr descr="" title="" id="49" name="Picture"/>
                   <a:graphic>
                     <a:graphicData uri="http://schemas.openxmlformats.org/drawingml/2006/picture">
                       <pic:pic>
                         <pic:nvPicPr>
-                          <pic:cNvPr descr="image/7.png" id="49" name="Picture"/>
+                          <pic:cNvPr descr="image/7.png" id="50" name="Picture"/>
                           <pic:cNvPicPr>
                             <a:picLocks noChangeArrowheads="1" noChangeAspect="1"/>
                           </pic:cNvPicPr>
                         </pic:nvPicPr>
                         <pic:blipFill>
-                          <a:blip r:embed="rId47"/>
+                          <a:blip r:embed="rId48"/>
                           <a:stretch>
                             <a:fillRect/>
                           </a:stretch>
@@ -1360,18 +1304,18 @@
               <w:t xml:space="preserve">Рисунок 7: Компоновка файла</w:t>
             </w:r>
           </w:p>
-          <w:bookmarkEnd w:id="50"/>
+          <w:bookmarkEnd w:id="51"/>
         </w:tc>
       </w:tr>
     </w:tbl>
-    <w:bookmarkEnd w:id="51"/>
-    <w:bookmarkStart w:id="56" w:name="запуск-исполняемого-файла"/>
+    <w:bookmarkEnd w:id="52"/>
+    <w:bookmarkStart w:id="57" w:name="запуск-исполняемого-файла"/>
     <w:p>
       <w:pPr>
         <w:pStyle w:val="Heading2"/>
       </w:pPr>
       <w:r>
-        <w:t xml:space="preserve">1.5 Запуск исполняемого файла</w:t>
+        <w:t xml:space="preserve">2.5 2.5 Запуск исполняемого файла</w:t>
       </w:r>
     </w:p>
     <w:p>
@@ -1379,7 +1323,19 @@
         <w:pStyle w:val="FirstParagraph"/>
       </w:pPr>
       <w:r>
-        <w:t xml:space="preserve">Далее я запустила программу с помощью команды ./hello . В консоли появилась строка</w:t>
+        <w:t xml:space="preserve">Далее я запустила программу с помощью команды</w:t>
+      </w:r>
+      <w:r>
+        <w:t xml:space="preserve"> </w:t>
+      </w:r>
+      <w:r>
+        <w:rPr>
+          <w:rStyle w:val="VerbatimChar"/>
+        </w:rPr>
+        <w:t xml:space="preserve">./hello</w:t>
+      </w:r>
+      <w:r>
+        <w:t xml:space="preserve">. В консоли появилась строка</w:t>
       </w:r>
       <w:r>
         <w:t xml:space="preserve"> </w:t>
@@ -1396,7 +1352,7 @@
       <w:r>
         <w:t xml:space="preserve">(</w:t>
       </w:r>
-      <w:hyperlink w:anchor="fig-8">
+      <w:hyperlink w:anchor="fig-1.8">
         <w:r>
           <w:rPr>
             <w:rStyle w:val="Hyperlink"/>
@@ -1422,7 +1378,7 @@
       <w:tr>
         <w:tc>
           <w:tcPr/>
-          <w:bookmarkStart w:id="55" w:name="fig-8"/>
+          <w:bookmarkStart w:id="56" w:name="fig-1.8"/>
           <w:p>
             <w:pPr>
               <w:pStyle w:val="Compact"/>
@@ -1433,18 +1389,18 @@
                 <wp:inline>
                   <wp:extent cx="4267200" cy="355915"/>
                   <wp:effectExtent b="0" l="0" r="0" t="0"/>
-                  <wp:docPr descr="" title="" id="53" name="Picture"/>
+                  <wp:docPr descr="" title="" id="54" name="Picture"/>
                   <a:graphic>
                     <a:graphicData uri="http://schemas.openxmlformats.org/drawingml/2006/picture">
                       <pic:pic>
                         <pic:nvPicPr>
-                          <pic:cNvPr descr="image/8.png" id="54" name="Picture"/>
+                          <pic:cNvPr descr="image/8.png" id="55" name="Picture"/>
                           <pic:cNvPicPr>
                             <a:picLocks noChangeArrowheads="1" noChangeAspect="1"/>
                           </pic:cNvPicPr>
                         </pic:nvPicPr>
                         <pic:blipFill>
-                          <a:blip r:embed="rId52"/>
+                          <a:blip r:embed="rId53"/>
                           <a:stretch>
                             <a:fillRect/>
                           </a:stretch>
@@ -1484,19 +1440,19 @@
               <w:t xml:space="preserve">Рисунок 8: Запуск программы</w:t>
             </w:r>
           </w:p>
-          <w:bookmarkEnd w:id="55"/>
+          <w:bookmarkEnd w:id="56"/>
         </w:tc>
       </w:tr>
     </w:tbl>
-    <w:bookmarkEnd w:id="56"/>
     <w:bookmarkEnd w:id="57"/>
-    <w:bookmarkStart w:id="78" w:name="задание-для-самостоятельной-работы"/>
+    <w:bookmarkEnd w:id="58"/>
+    <w:bookmarkStart w:id="79" w:name="задание-для-самостоятельной-работы"/>
     <w:p>
       <w:pPr>
         <w:pStyle w:val="Heading1"/>
       </w:pPr>
       <w:r>
-        <w:t xml:space="preserve">2. Задание для самостоятельной работы</w:t>
+        <w:t xml:space="preserve">3. 3 Задание для самостоятельной работы</w:t>
       </w:r>
     </w:p>
     <w:p>
@@ -1536,7 +1492,7 @@
       <w:r>
         <w:t xml:space="preserve">(</w:t>
       </w:r>
-      <w:hyperlink w:anchor="fig-9">
+      <w:hyperlink w:anchor="fig-2.1">
         <w:r>
           <w:rPr>
             <w:rStyle w:val="Hyperlink"/>
@@ -1562,7 +1518,7 @@
       <w:tr>
         <w:tc>
           <w:tcPr/>
-          <w:bookmarkStart w:id="61" w:name="fig-9"/>
+          <w:bookmarkStart w:id="62" w:name="fig-2.1"/>
           <w:p>
             <w:pPr>
               <w:pStyle w:val="Compact"/>
@@ -1573,18 +1529,18 @@
                 <wp:inline>
                   <wp:extent cx="4267200" cy="355915"/>
                   <wp:effectExtent b="0" l="0" r="0" t="0"/>
-                  <wp:docPr descr="" title="" id="59" name="Picture"/>
+                  <wp:docPr descr="" title="" id="60" name="Picture"/>
                   <a:graphic>
                     <a:graphicData uri="http://schemas.openxmlformats.org/drawingml/2006/picture">
                       <pic:pic>
                         <pic:nvPicPr>
-                          <pic:cNvPr descr="image/9.png" id="60" name="Picture"/>
+                          <pic:cNvPr descr="image/9.png" id="61" name="Picture"/>
                           <pic:cNvPicPr>
                             <a:picLocks noChangeArrowheads="1" noChangeAspect="1"/>
                           </pic:cNvPicPr>
                         </pic:nvPicPr>
                         <pic:blipFill>
-                          <a:blip r:embed="rId58"/>
+                          <a:blip r:embed="rId59"/>
                           <a:stretch>
                             <a:fillRect/>
                           </a:stretch>
@@ -1624,7 +1580,7 @@
               <w:t xml:space="preserve">Рисунок 9: Создание копии файла hello.asm</w:t>
             </w:r>
           </w:p>
-          <w:bookmarkEnd w:id="61"/>
+          <w:bookmarkEnd w:id="62"/>
         </w:tc>
       </w:tr>
     </w:tbl>
@@ -1635,7 +1591,7 @@
       <w:r>
         <w:t xml:space="preserve">Внутри нового файла я внесла изменения, заменив приветствие на свое ФИО: «Зорова Ульяна Владимировна» (</w:t>
       </w:r>
-      <w:hyperlink w:anchor="fig-10">
+      <w:hyperlink w:anchor="fig-2.2">
         <w:r>
           <w:rPr>
             <w:rStyle w:val="Hyperlink"/>
@@ -1661,7 +1617,7 @@
       <w:tr>
         <w:tc>
           <w:tcPr/>
-          <w:bookmarkStart w:id="65" w:name="fig-10"/>
+          <w:bookmarkStart w:id="66" w:name="fig-2.2"/>
           <w:p>
             <w:pPr>
               <w:pStyle w:val="Compact"/>
@@ -1672,18 +1628,18 @@
                 <wp:inline>
                   <wp:extent cx="4267200" cy="3046745"/>
                   <wp:effectExtent b="0" l="0" r="0" t="0"/>
-                  <wp:docPr descr="" title="" id="63" name="Picture"/>
+                  <wp:docPr descr="" title="" id="64" name="Picture"/>
                   <a:graphic>
                     <a:graphicData uri="http://schemas.openxmlformats.org/drawingml/2006/picture">
                       <pic:pic>
                         <pic:nvPicPr>
-                          <pic:cNvPr descr="image/10.png" id="64" name="Picture"/>
+                          <pic:cNvPr descr="image/10.png" id="65" name="Picture"/>
                           <pic:cNvPicPr>
                             <a:picLocks noChangeArrowheads="1" noChangeAspect="1"/>
                           </pic:cNvPicPr>
                         </pic:nvPicPr>
                         <pic:blipFill>
-                          <a:blip r:embed="rId62"/>
+                          <a:blip r:embed="rId63"/>
                           <a:stretch>
                             <a:fillRect/>
                           </a:stretch>
@@ -1723,7 +1679,7 @@
               <w:t xml:space="preserve">Рисунок 10: Редактирование файла lab4.asm</w:t>
             </w:r>
           </w:p>
-          <w:bookmarkEnd w:id="65"/>
+          <w:bookmarkEnd w:id="66"/>
         </w:tc>
       </w:tr>
     </w:tbl>
@@ -1758,7 +1714,7 @@
       <w:r>
         <w:t xml:space="preserve">). При запуске программа успешно вывела мое ФИО (</w:t>
       </w:r>
-      <w:hyperlink w:anchor="fig-11">
+      <w:hyperlink w:anchor="fig-2.3">
         <w:r>
           <w:rPr>
             <w:rStyle w:val="Hyperlink"/>
@@ -1784,7 +1740,7 @@
       <w:tr>
         <w:tc>
           <w:tcPr/>
-          <w:bookmarkStart w:id="69" w:name="fig-11"/>
+          <w:bookmarkStart w:id="70" w:name="fig-2.3"/>
           <w:p>
             <w:pPr>
               <w:pStyle w:val="Compact"/>
@@ -1795,18 +1751,18 @@
                 <wp:inline>
                   <wp:extent cx="4267200" cy="185333"/>
                   <wp:effectExtent b="0" l="0" r="0" t="0"/>
-                  <wp:docPr descr="" title="" id="67" name="Picture"/>
+                  <wp:docPr descr="" title="" id="68" name="Picture"/>
                   <a:graphic>
                     <a:graphicData uri="http://schemas.openxmlformats.org/drawingml/2006/picture">
                       <pic:pic>
                         <pic:nvPicPr>
-                          <pic:cNvPr descr="image/11.png" id="68" name="Picture"/>
+                          <pic:cNvPr descr="image/11.png" id="69" name="Picture"/>
                           <pic:cNvPicPr>
                             <a:picLocks noChangeArrowheads="1" noChangeAspect="1"/>
                           </pic:cNvPicPr>
                         </pic:nvPicPr>
                         <pic:blipFill>
-                          <a:blip r:embed="rId66"/>
+                          <a:blip r:embed="rId67"/>
                           <a:stretch>
                             <a:fillRect/>
                           </a:stretch>
@@ -1846,7 +1802,7 @@
               <w:t xml:space="preserve">Рисунок 11: Трансляция, компоновка и запуск программы</w:t>
             </w:r>
           </w:p>
-          <w:bookmarkEnd w:id="69"/>
+          <w:bookmarkEnd w:id="70"/>
         </w:tc>
       </w:tr>
     </w:tbl>
@@ -1881,7 +1837,7 @@
       <w:r>
         <w:t xml:space="preserve">) в локальную папку репозитория (</w:t>
       </w:r>
-      <w:hyperlink w:anchor="fig-12">
+      <w:hyperlink w:anchor="fig-2.4">
         <w:r>
           <w:rPr>
             <w:rStyle w:val="Hyperlink"/>
@@ -1907,7 +1863,7 @@
       <w:tr>
         <w:tc>
           <w:tcPr/>
-          <w:bookmarkStart w:id="73" w:name="fig-12"/>
+          <w:bookmarkStart w:id="74" w:name="fig-2.4"/>
           <w:p>
             <w:pPr>
               <w:pStyle w:val="Compact"/>
@@ -1918,18 +1874,18 @@
                 <wp:inline>
                   <wp:extent cx="4267200" cy="472622"/>
                   <wp:effectExtent b="0" l="0" r="0" t="0"/>
-                  <wp:docPr descr="" title="" id="71" name="Picture"/>
+                  <wp:docPr descr="" title="" id="72" name="Picture"/>
                   <a:graphic>
                     <a:graphicData uri="http://schemas.openxmlformats.org/drawingml/2006/picture">
                       <pic:pic>
                         <pic:nvPicPr>
-                          <pic:cNvPr descr="image/12.png" id="72" name="Picture"/>
+                          <pic:cNvPr descr="image/12.png" id="73" name="Picture"/>
                           <pic:cNvPicPr>
                             <a:picLocks noChangeArrowheads="1" noChangeAspect="1"/>
                           </pic:cNvPicPr>
                         </pic:nvPicPr>
                         <pic:blipFill>
-                          <a:blip r:embed="rId70"/>
+                          <a:blip r:embed="rId71"/>
                           <a:stretch>
                             <a:fillRect/>
                           </a:stretch>
@@ -1969,7 +1925,7 @@
               <w:t xml:space="preserve">Рисунок 12: Копирование файлов</w:t>
             </w:r>
           </w:p>
-          <w:bookmarkEnd w:id="73"/>
+          <w:bookmarkEnd w:id="74"/>
         </w:tc>
       </w:tr>
     </w:tbl>
@@ -1980,7 +1936,7 @@
       <w:r>
         <w:t xml:space="preserve">Далее я отправила файлы в удаленный репозиторий на GitHub (</w:t>
       </w:r>
-      <w:hyperlink w:anchor="fig-13">
+      <w:hyperlink w:anchor="fig-2.5">
         <w:r>
           <w:rPr>
             <w:rStyle w:val="Hyperlink"/>
@@ -2006,7 +1962,7 @@
       <w:tr>
         <w:tc>
           <w:tcPr/>
-          <w:bookmarkStart w:id="77" w:name="fig-13"/>
+          <w:bookmarkStart w:id="78" w:name="fig-2.5"/>
           <w:p>
             <w:pPr>
               <w:pStyle w:val="Compact"/>
@@ -2017,18 +1973,18 @@
                 <wp:inline>
                   <wp:extent cx="4267200" cy="395416"/>
                   <wp:effectExtent b="0" l="0" r="0" t="0"/>
-                  <wp:docPr descr="" title="" id="75" name="Picture"/>
+                  <wp:docPr descr="" title="" id="76" name="Picture"/>
                   <a:graphic>
                     <a:graphicData uri="http://schemas.openxmlformats.org/drawingml/2006/picture">
                       <pic:pic>
                         <pic:nvPicPr>
-                          <pic:cNvPr descr="image/13.png" id="76" name="Picture"/>
+                          <pic:cNvPr descr="image/13.png" id="77" name="Picture"/>
                           <pic:cNvPicPr>
                             <a:picLocks noChangeArrowheads="1" noChangeAspect="1"/>
                           </pic:cNvPicPr>
                         </pic:nvPicPr>
                         <pic:blipFill>
-                          <a:blip r:embed="rId74"/>
+                          <a:blip r:embed="rId75"/>
                           <a:stretch>
                             <a:fillRect/>
                           </a:stretch>
@@ -2068,18 +2024,18 @@
               <w:t xml:space="preserve">Рисунок 13: Обновление репозитория</w:t>
             </w:r>
           </w:p>
-          <w:bookmarkEnd w:id="77"/>
+          <w:bookmarkEnd w:id="78"/>
         </w:tc>
       </w:tr>
     </w:tbl>
-    <w:bookmarkEnd w:id="78"/>
-    <w:bookmarkStart w:id="79" w:name="вывод"/>
+    <w:bookmarkEnd w:id="79"/>
+    <w:bookmarkStart w:id="80" w:name="вывод"/>
     <w:p>
       <w:pPr>
         <w:pStyle w:val="Heading1"/>
       </w:pPr>
       <w:r>
-        <w:t xml:space="preserve">3. Вывод</w:t>
+        <w:t xml:space="preserve">4. 4 Вывод</w:t>
       </w:r>
     </w:p>
     <w:p>
@@ -2090,7 +2046,7 @@
         <w:t xml:space="preserve">В ходе проделанной работы я получила практические навыки написания, компиляции и сборки программ на ассемблере NASM, а также закрепила знания о работе с командной строкой Linux.</w:t>
       </w:r>
     </w:p>
-    <w:bookmarkEnd w:id="79"/>
+    <w:bookmarkEnd w:id="80"/>
     <w:sectPr/>
   </w:body>
 </w:document>

</xml_diff>